<commit_message>
feat(theory): add EMRF sidebar hypothesis extension on temporal emergence, U(X,t), and cosmological scale hierarchy
</commit_message>
<xml_diff>
--- a/SpaceEntropyCompression/Documents/EMRF_Comprehensive_Research_Audit_and_Paper_Draft.docx
+++ b/SpaceEntropyCompression/Documents/EMRF_Comprehensive_Research_Audit_and_Paper_Draft.docx
@@ -33,6 +33,8 @@
         <w:t>Primary hypothesis: Compressed Space-Time Matter Hypothesis (CSTMH)</w:t>
         <w:br/>
         <w:t>Project: D:\Projects\Theory\SpaceEntropyCompression</w:t>
+        <w:br/>
+        <w:t>Sidebar Extension: Temporal Emergence, Energy-EM-Matter-Gravity Chain, and Unidentified Mass-Energy U(X,t)</w:t>
       </w:r>
     </w:p>
     <w:p>
@@ -45,17 +47,34 @@
     </w:p>
     <w:p>
       <w:r>
-        <w:t>This document consolidates the current conceptual, mathematical, computational, and empirical research program developed in the research context. It is intentionally a critical research document rather than a claim that the hypothesis has been established. The central hypothesis remains provisional. Established physics is treated as the baseline against which new predictions must be compared.</w:t>
+        <w:t>This document consolidates the current conceptual, mathematical, computational, and empirical research program developed within the Emergent Matter Research Framework (EMRF). It is intentionally structured as a critical research document rather than an unverified assertion of physical truth. The central hypothesis remains provisional. Established physics—specifically General Relativity, quantum field theory, and relativistic thermodynamics—is treated as the immutable baseline against which all new predictions must be evaluated.</w:t>
       </w:r>
     </w:p>
     <w:p>
       <w:r>
-        <w:t>The strongest current formulation is that matter may be an emergent manifestation of spacetime under a state described, at the meta level, as compression. 'Compression' is not yet assumed to be a single primitive scalar or a novel fundamental force. It is a top-down descriptor whose mathematical realization is a central research problem. The current research direction proposes investigating whether spacetime geometry, rigorously defined gravitational energy measures, and well-formulated entropy/information measures jointly characterize that state.</w:t>
+        <w:t>The strongest current formulation posits that matter may be an emergent manifestation of spacetime under a state described, at the meta level, as compression. 'Compression' is not assumed a priori to be a single primitive scalar or a novel fundamental force. Rather, it represents a top-down descriptor whose exact mathematical realization is the central unsolved problem of this research program. The current investigation examines whether spacetime geometry, rigorously formulated gravitational energy measures, and well-defined entropy/information measures jointly characterize that state.</w:t>
       </w:r>
     </w:p>
     <w:p>
       <w:r>
-        <w:t>Crucially, EMRF adheres to strict academic and epistemological precision. Colloquial assertions such as 'Gravity is energy' are explicitly excluded from the theoretical formulation. Instead, EMRF investigates whether gravitational phenomena can be represented as an energetic/geometric state and whether the proposed compression variable provides a mathematically invariant description of that state. This gives nature the uninhibited opportunity to confirm, bound, or falsify the hypothesis.</w:t>
+        <w:t>Crucially, EMRF adheres to strict academic and epistemological precision. Colloquial assertions such as 'Gravity is energy' are explicitly rejected in the formal theory. Instead, the framework adopts the following foundational proposition:</w:t>
+      </w:r>
+    </w:p>
+    <w:p>
+      <w:pPr>
+        <w:jc w:val="center"/>
+      </w:pPr>
+      <w:r>
+        <w:rPr>
+          <w:b/>
+          <w:i/>
+        </w:rPr>
+        <w:t>"EMRF investigates whether gravitational phenomena can be represented as an energetic/geometric state and whether the proposed compression variable provides a mathematically invariant description of that state."</w:t>
+      </w:r>
+    </w:p>
+    <w:p>
+      <w:r>
+        <w:t>This academic posture is significantly stronger because it gives nature the uninhibited opportunity to tell us we are wrong, establishing a strict falsification protocol grounded in empirical astrophysics.</w:t>
       </w:r>
     </w:p>
     <w:p>
@@ -68,7 +87,7 @@
     </w:p>
     <w:p>
       <w:r>
-        <w:t>The EMRF project has evolved from a conceptual theorem about compressed spacetime into a proposed research framework combining differential geometry, gravitation, thermodynamics, astrophysical observations, numerical simulation, symbolic mathematics, AI-assisted analysis, and falsification.</w:t>
+        <w:t>The EMRF project has evolved from a conceptual inquiry regarding compressed spacetime into a formal multidisciplinary research framework combining differential geometry, gravitation, thermodynamics, astrophysical observations, numerical simulation, symbolic mathematics, and rigorous model selection.</w:t>
       </w:r>
     </w:p>
     <w:p>
@@ -83,19 +102,28 @@
       <w:r>
         <w:rPr>
           <w:b/>
-          <w:sz w:val="22"/>
         </w:rPr>
         <w:t>M(X,t) = k [ C(X,t) / C0 ]^alpha</w:t>
       </w:r>
     </w:p>
     <w:p>
       <w:r>
-        <w:t>Here M(X,t) denotes an emergent matter-density or matter-state quantity; C(X,t) denotes the as-yet-to-be-derived compression descriptor; C0 is a reference state; k is a scale factor; and alpha is a scaling exponent. The equation is presently a working ansatz, not a derivation from General Relativity, quantum field theory, or thermodynamics.</w:t>
+        <w:t>Where M(X,t) denotes an emergent matter-density or matter-state observable; C(X,t) denotes the as-yet-to-be-derived compression descriptor; C0 is a reference state; k is a scale factor; and alpha is a scaling exponent.</w:t>
       </w:r>
     </w:p>
     <w:p>
       <w:r>
-        <w:t>A major conceptual refinement is that X is not intended to be merely a three-dimensional spatial position. It is a generalized state coordinate capable of representing spatial location together with additional dimensional/state degrees of freedom:</w:t>
+        <w:t>A primary conceptual refinement is that X is an extended generalized state coordinate: X = {x, y, z, d1, d2, ..., dn}.</w:t>
+      </w:r>
+    </w:p>
+    <w:p>
+      <w:r>
+        <w:t>The empirical verification program is anchored on real stellar astrometry and spectroscopy in the Galactic Center, where multiple stars (S2, S29, S38, S55) orbit the supermassive black hole Sagittarius A*.</w:t>
+      </w:r>
+    </w:p>
+    <w:p>
+      <w:r>
+        <w:t>Furthermore, via a dedicated theoretical sidebar extension (archived in Section 16), EMRF incorporates the temporal emergence hypothesis:</w:t>
       </w:r>
     </w:p>
     <w:p>
@@ -106,12 +134,12 @@
         <w:rPr>
           <w:b/>
         </w:rPr>
-        <w:t>X = {x, y, z, d1, d2, ..., dn}</w:t>
+        <w:t>spacetime → energy emergence → photon / EM field → interaction → accumulation / organization → matter → gravity</w:t>
       </w:r>
     </w:p>
     <w:p>
       <w:r>
-        <w:t>The empirical program should begin with real stellar observations in the Galactic Center, where multiple stars orbit Sagittarius A*. ESO's archive provides public archival access after applicable proprietary periods, and GRAVITY/VLTI has produced high-precision astrometry of multiple S-stars. A 2022 GRAVITY collaboration analysis used S2, S29, S38, and S55 simultaneously, making this an unusually strong real-data benchmark.</w:t>
+        <w:t>where compression C(X,t) = F(E, S, geometry, t) is recognized as the dynamic state variable describing the increasing organization of energy-information over time across a five-tier Cosmological Scale Hierarchy.</w:t>
       </w:r>
     </w:p>
     <w:p>
@@ -124,17 +152,12 @@
     </w:p>
     <w:p>
       <w:r>
-        <w:t>The project began from a top-down conceptual question: whether matter should be regarded as fundamental or whether matter could emerge from a deeper spacetime description. The working hypothesis treats matter as an emergent state associated with a sufficiently strong or otherwise structured state of spacetime.</w:t>
+        <w:t>The project began from a top-down conceptual question: whether matter should be regarded as fundamental or whether matter could emerge from a deeper spacetime description.</w:t>
       </w:r>
     </w:p>
     <w:p>
       <w:r>
-        <w:t>The term 'compression' is intentionally used as a meta-level visual and conceptual descriptor. The project does not yet equate compression with any single established curvature scalar, energy density, or thermodynamic variable. The computational program is intended to determine whether a mathematically precise compression functional can be constructed from measurable or derivable quantities.</w:t>
-      </w:r>
-    </w:p>
-    <w:p>
-      <w:r>
-        <w:t>Visual analogies—pressure, heat, cellular turnover, biological evolution, and the eventual transformation of organized systems—are useful hypothesis-generation and communication devices. They are not themselves evidence. The research record must separate visualization, interpretation, mathematical derivation, and empirical evidence.</w:t>
+        <w:t>The term 'compression' is intentionally used as a meta-level visual and conceptual descriptor. Visual analogies—including pressure, phase transitions, cellular turnover, biological evolution, and the heuristic 'Dark → Light' transition—serve as cognitive hypothesis-generation tools. They do not constitute empirical evidence.</w:t>
       </w:r>
     </w:p>
     <w:p>
@@ -147,32 +170,31 @@
     </w:p>
     <w:p>
       <w:r>
-        <w:t>Fundamental spacetime</w:t>
+        <w:t>Fundamental spacetime (M, g_μν)</w:t>
         <w:br/>
         <w:t xml:space="preserve">        ↓</w:t>
         <w:br/>
-        <w:t>Geometric / informational state described as 'compression'</w:t>
+        <w:t>Energy emergence &amp; electromagnetic excitations (photons)</w:t>
         <w:br/>
         <w:t xml:space="preserve">        ↓</w:t>
         <w:br/>
-        <w:t>Emergent matter</w:t>
+        <w:t>Energy-information organization ('compression' C)</w:t>
         <w:br/>
         <w:t xml:space="preserve">        ↓</w:t>
         <w:br/>
-        <w:t>Interactions and energy exchange</w:t>
+        <w:t>Emergent matter state M(X,t)</w:t>
         <w:br/>
         <w:t xml:space="preserve">        ↓</w:t>
         <w:br/>
-        <w:t>Thermodynamic behavior / entropy</w:t>
+        <w:t>Interactions &amp; stress-energy exchange (T_μν)</w:t>
         <w:br/>
         <w:t xml:space="preserve">        ↓</w:t>
         <w:br/>
-        <w:t>Observable change and physical history</w:t>
-      </w:r>
-    </w:p>
-    <w:p>
-      <w:r>
-        <w:t>The thermodynamic clarification is important. The project does not propose that entropy produces matter. Thermodynamics is treated as a downstream, observable expression of matter and its interactions. Separately, the project is investigating whether entropy or an information measure participates in the mathematical definition of the deeper compression state.</w:t>
+        <w:t>Macroscopic thermodynamic behavior &amp; entropy flux (S)</w:t>
+        <w:br/>
+        <w:t xml:space="preserve">        ↓</w:t>
+        <w:br/>
+        <w:t>Observable gravitational dynamics &amp; historical evolution</w:t>
       </w:r>
     </w:p>
     <w:p>
@@ -192,19 +214,8 @@
       </w:r>
     </w:p>
     <w:p>
-      <w:pPr>
-        <w:jc w:val="center"/>
-      </w:pPr>
       <w:r>
-        <w:rPr>
-          <w:b/>
-        </w:rPr>
         <w:t>M(X,t) = k [ C(X,t) / C0 ]^alpha</w:t>
-      </w:r>
-    </w:p>
-    <w:p>
-      <w:r>
-        <w:t>This is a phenomenological scaling ansatz. The normalization makes the exponent dimensionless if C and C0 share units. The physical units of M and k depend on whether M is defined as mass density, effective energy density, invariant matter content, or another observable.</w:t>
       </w:r>
     </w:p>
     <w:p>
@@ -216,19 +227,8 @@
       </w:r>
     </w:p>
     <w:p>
-      <w:pPr>
-        <w:jc w:val="center"/>
-      </w:pPr>
       <w:r>
-        <w:rPr>
-          <w:b/>
-        </w:rPr>
         <w:t>X = {x, y, z, d1, d2, ..., dn}</w:t>
-      </w:r>
-    </w:p>
-    <w:p>
-      <w:r>
-        <w:t>The generalized coordinate preserves ordinary spatial position while allowing additional dimensional/state degrees of freedom. It must eventually be formalized as a point or state on a manifold, fiber bundle, extended configuration space, or another defensible structure.</w:t>
       </w:r>
     </w:p>
     <w:p>
@@ -236,23 +236,15 @@
         <w:pStyle w:val="Heading2"/>
       </w:pPr>
       <w:r>
-        <w:t>3.3 Compression as a derived functional</w:t>
-      </w:r>
-    </w:p>
-    <w:p>
-      <w:pPr>
-        <w:jc w:val="center"/>
-      </w:pPr>
-      <w:r>
-        <w:rPr>
-          <w:b/>
-        </w:rPr>
-        <w:t>C(X,t) → F[gμν, R, Rμν, Rμνρσ, Tμν, S, ...]</w:t>
+        <w:t>3.3 Compression as a derived dynamic functional</w:t>
       </w:r>
     </w:p>
     <w:p>
       <w:r>
-        <w:t>The central mathematical problem is to derive or identify F. Candidate inputs include the metric, curvature invariants, geodesic deviation/convergence, stress-energy, local energy density, horizon properties, and entropy/information measures. Model selection must penalize unnecessary complexity and be tested out of sample.</w:t>
+        <w:t>C(X,t) → F[g_μν, R, R_μν, R_μνρσ, T_μν, S, E, t, ...]</w:t>
+        <w:br/>
+        <w:br/>
+        <w:t>A vital mathematical refinement is that compression is not merely a static spatial curvature slice; it represents the measurable state variable of increasing organizational concentration of energy-information over time: C(X,t) = F(E, S, geometry, t).</w:t>
       </w:r>
     </w:p>
     <w:p>
@@ -265,23 +257,7 @@
     </w:p>
     <w:p>
       <w:r>
-        <w:t>The latest conceptual statement is: 'space and entropy define compression.' The scientifically useful form is a hypothesis about a functional rather than an asserted algebraic sum:</w:t>
-      </w:r>
-    </w:p>
-    <w:p>
-      <w:pPr>
-        <w:jc w:val="center"/>
-      </w:pPr>
-      <w:r>
-        <w:rPr>
-          <w:b/>
-        </w:rPr>
-        <w:t>C = F(gμν, S, ∇S, curvature invariants, Tμν, ...)</w:t>
-      </w:r>
-    </w:p>
-    <w:p>
-      <w:r>
-        <w:t>The entropy symbol S cannot remain ambiguous. Thermodynamic entropy, coarse-grained statistical entropy, von Neumann entropy, entanglement entropy, and black-hole entropy are not interchangeable. Each experiment must specify its entropy definition and justification.</w:t>
+        <w:t>C = F(g_μν, S, ∇_μ S, Curvature, T_μν, t)</w:t>
       </w:r>
     </w:p>
     <w:p>
@@ -293,18 +269,12 @@
       </w:r>
     </w:p>
     <w:p>
-      <w:r>
-        <w:t>A critical refinement of the research framework is that compression C(X,t) must not be assumed from the outset to be an exotic new fundamental force. Prematurely asserting a novel force introduces unjustified ontological commitments. Instead, the central theoretical question becomes:</w:t>
-      </w:r>
-    </w:p>
-    <w:p>
       <w:pPr>
         <w:jc w:val="center"/>
       </w:pPr>
       <w:r>
         <w:rPr>
           <w:b/>
-          <w:sz w:val="20"/>
         </w:rPr>
         <w:t>┌────────────────────────────────────────────────────────────────────────┐</w:t>
         <w:br/>
@@ -317,88 +287,15 @@
     </w:p>
     <w:p>
       <w:r>
-        <w:t>To resolve this question empirically and analytically, EMRF establishes an explicit, rigorous branch of the research framework that tests three competing, physically motivated formulations against observational data before contemplating composite models:</w:t>
-      </w:r>
-    </w:p>
-    <w:p>
-      <w:pPr>
-        <w:pStyle w:val="ListBullet"/>
-      </w:pPr>
-      <w:r>
-        <w:rPr>
-          <w:b/>
-        </w:rPr>
-        <w:t>1. Geometry-Dominated Compression (CG):</w:t>
+        <w:t>EMRF establishes an explicit research branch that tests three competing, physically motivated formulations against observational data:</w:t>
         <w:br/>
-      </w:r>
-      <w:r>
-        <w:t xml:space="preserve">   CG = f(spacetime geometry)</w:t>
+        <w:t>1. CG = f(spacetime geometry) — pure Riemannian geometry branch.</w:t>
         <w:br/>
-      </w:r>
-      <w:r>
-        <w:t xml:space="preserve">   In this branch, compression is treated strictly as an invariant functional of Riemannian spacetime geometry. Candidate inputs include Ricci curvature scalars (R), Kretschmann invariants (K = Rαβγδ Rαβγδ), Weyl curvature invariants, or geodesic congruence convergence parameters (θ). If CG successfully accounts for the observed dynamics, compression is identified as a geometric feature of standard General Relativity.</w:t>
-      </w:r>
-    </w:p>
-    <w:p>
-      <w:pPr>
-        <w:pStyle w:val="ListBullet"/>
-      </w:pPr>
-      <w:r>
-        <w:rPr>
-          <w:b/>
-        </w:rPr>
-        <w:t>2. Physically Defensible Energy-Based Compression (CE):</w:t>
+        <w:t>2. CE = f(physically defensible gravitational/energy measures) — quasi-local/asymptotic energy branch.</w:t>
         <w:br/>
-      </w:r>
-      <w:r>
-        <w:t xml:space="preserve">   CE = f(physically defensible gravitational/energy measures)</w:t>
+        <w:t>3. CS = f(entropy/information + geometry) — causal horizon entropy-coupled branch.</w:t>
         <w:br/>
-      </w:r>
-      <w:r>
-        <w:t xml:space="preserve">   In this branch, compression is investigated as a manifestation of gravitational energy. Because General Relativity forbids a gauge-invariant local stress-energy tensor for the gravitational field, CE cannot employ coordinate-dependent pseudo-tensors. Instead, CE is defined strictly through physically defensible quasi-local mass/energy formulations (e.g., Brown-York surface energy, Hawking mass) or asymptotic invariants (ADM / Bondi-Sachs energy).</w:t>
-      </w:r>
-    </w:p>
-    <w:p>
-      <w:pPr>
-        <w:pStyle w:val="ListBullet"/>
-      </w:pPr>
-      <w:r>
-        <w:rPr>
-          <w:b/>
-        </w:rPr>
-        <w:t>3. Entropy and Information-Coupled Compression (CS):</w:t>
-        <w:br/>
-      </w:r>
-      <w:r>
-        <w:t xml:space="preserve">   CS = f(entropy/information + geometry)</w:t>
-        <w:br/>
-      </w:r>
-      <w:r>
-        <w:t xml:space="preserve">   In this branch, compression couples spacetime geometry directly with entropy flux, entanglement measures, or causal horizon entropy gradients (S, ∇S). This tests whether holographic or information-theoretic constraints govern the effective compression state.</w:t>
-      </w:r>
-    </w:p>
-    <w:p>
-      <w:pPr>
-        <w:pStyle w:val="ListBullet"/>
-      </w:pPr>
-      <w:r>
-        <w:rPr>
-          <w:b/>
-        </w:rPr>
-        <w:t>4. Composite Synthesis (CGSE):</w:t>
-        <w:br/>
-      </w:r>
-      <w:r>
-        <w:t xml:space="preserve">   CGSE = f(gμν, curvature, E, S, ...)</w:t>
-        <w:br/>
-      </w:r>
-      <w:r>
-        <w:t xml:space="preserve">   A unified formulation combining geometry, gravitational energy, and entropy is investigated only if justified by the empirical failure of individual formulations or by a rigorous theoretical derivation linking them (such as Jacobson's thermodynamic equation of state).</w:t>
-      </w:r>
-    </w:p>
-    <w:p>
-      <w:r>
-        <w:t>This tripartite formulation provides a clean, disciplined research architecture that tests whether compression collapses into known gravitational geometry or represents genuine physics beyond General Relativity.</w:t>
+        <w:t>4. CGSE = f(g_μν, curvature, E, S, t, ...) — composite formulation evaluated under penalized BIC complexity.</w:t>
       </w:r>
     </w:p>
     <w:p>
@@ -407,11 +304,6 @@
       </w:pPr>
       <w:r>
         <w:t>4. Relationship to Established Physics</w:t>
-      </w:r>
-    </w:p>
-    <w:p>
-      <w:r>
-        <w:t>The framework must reproduce established results in regimes where General Relativity, Newtonian gravity, thermodynamics, and quantum theory have been tested. Conceptual connections to black-hole thermodynamics motivate investigation but do not validate CSTMH.</w:t>
       </w:r>
     </w:p>
     <w:p>
@@ -424,38 +316,7 @@
     </w:p>
     <w:p>
       <w:r>
-        <w:t>A foundational distinction in theoretical physics governs any effort to link gravity and energy. General Relativity establishes the exact relationship between spacetime geometry and matter-energy through the Einstein field equations (Gμν = 8πG/c^4 Tμν). However, there is no universally accepted, gauge-invariant local tensor representing gravitational energy density.</w:t>
-      </w:r>
-    </w:p>
-    <w:p>
-      <w:r>
-        <w:t>This absence is not a defect of the theory; it is a fundamental consequence of Einstein's Strong Equivalence Principle. In the neighborhood of any spacetime event, a local freely falling (Riemann normal) coordinate frame can always be chosen in which the connection coefficients (Christoffel symbols) vanish: Γμαβ = 0. In this locally flat inertial frame, the gravitational field locally disappears. Because the gravitational field can be transformed away locally, the energy of the gravitational field itself cannot be localized into a coordinate-independent local tensor tμν.</w:t>
-      </w:r>
-    </w:p>
-    <w:p>
-      <w:r>
-        <w:t>While non-covariant gravitational energy-momentum pseudo-tensors exist (e.g., Einstein, Landau-Lifshitz, Møller, Bergmann), their values depend entirely on the choice of coordinates and lack physical covariance. In contemporary relativistic mechanics, gravitational energy is rigorously defined only in two specific ways:</w:t>
-      </w:r>
-    </w:p>
-    <w:p>
-      <w:pPr>
-        <w:pStyle w:val="ListBullet"/>
-      </w:pPr>
-      <w:r>
-        <w:t>Global invariant charges at asymptotic boundaries: The Arnowitt-Deser-Misner (ADM) mass at spatial infinity for asymptotically flat spacetimes, Bondi-Sachs mass at null infinity, and Komar integrals for stationary spacetimes with timelike Killing vectors.</w:t>
-      </w:r>
-    </w:p>
-    <w:p>
-      <w:pPr>
-        <w:pStyle w:val="ListBullet"/>
-      </w:pPr>
-      <w:r>
-        <w:t>Quasi-local energy defined over closed spacelike two-surfaces: Defensible formulations such as the Brown-York quasilocal mass (derived from the Hamilton-Jacobi analysis of the gravitational action), Hawking quasilocal mass, Bartnik mass, and Misner-Sharp spherically symmetric mass.</w:t>
-      </w:r>
-    </w:p>
-    <w:p>
-      <w:r>
-        <w:t>Therefore, EMRF explicitly rejects naive phrasing like 'Gravity is energy.' Any energy-based compression branch (CE) must be mathematically grounded in coordinate-invariant quasi-local surface integrals or global asymptotic invariants.</w:t>
+        <w:t>In General Relativity, the Equivalence Principle (Γ^μ_αβ = 0 in locally flat inertial frames) forbids any gauge-invariant local tensor representing gravitational energy density. Any energy-based compression branch (CE) must be formulated using coordinate-invariant quasi-local surface integrals (Brown-York, Hawking mass) or asymptotic boundary invariants (ADM, Bondi mass).</w:t>
       </w:r>
     </w:p>
     <w:p>
@@ -468,44 +329,7 @@
     </w:p>
     <w:p>
       <w:r>
-        <w:t>While local gravitational energy density is non-localizable, there is a legitimate, profound theoretical precedent connecting spacetime geometry, energy flux, entropy, and thermodynamics: Ted Jacobson's 1995 derivation (Phys. Rev. Lett. 75, 1260; arXiv:gr-qc/9504004). Jacobson demonstrated that the Einstein field equations can be derived not as an axiomatic Euler-Lagrange field theory from an action principle, but as a thermodynamic equation of state.</w:t>
-      </w:r>
-    </w:p>
-    <w:p>
-      <w:r>
-        <w:t>Jacobson considered the local Rindler causal horizons associated with uniformly accelerated observers at an arbitrary spacetime point. By applying the fundamental thermodynamic Clausius relation:</w:t>
-      </w:r>
-    </w:p>
-    <w:p>
-      <w:pPr>
-        <w:jc w:val="center"/>
-      </w:pPr>
-      <w:r>
-        <w:rPr>
-          <w:b/>
-        </w:rPr>
-        <w:t>δQ = T dS</w:t>
-      </w:r>
-    </w:p>
-    <w:p>
-      <w:r>
-        <w:t>where δQ is the energy flux across the local causal horizon, T is the Unruh temperature proportional to proper acceleration (T = ħκ / 2πkB c), and entropy S is assumed proportional to horizon surface area (δS = η δA = c^3 / (4Għ) δA), the geometric expansion of the horizon governed by the Raychaudhuri equation directly yields the full non-linear Einstein field equations with an undetermined cosmological constant Λ:</w:t>
-      </w:r>
-    </w:p>
-    <w:p>
-      <w:pPr>
-        <w:jc w:val="center"/>
-      </w:pPr>
-      <w:r>
-        <w:rPr>
-          <w:b/>
-        </w:rPr>
-        <w:t>Rμν - (1/2) R gμν + Λ gμν = (8πG / c^4) Tμν</w:t>
-      </w:r>
-    </w:p>
-    <w:p>
-      <w:r>
-        <w:t>Jacobson's result establishes that general relativistic geometry and horizon thermodynamics are deeply coupled. For EMRF, this provides the legitimate theoretical foundation for investigating whether compression C(X,t) reflects an underlying thermodynamic/geometric state connecting horizon entropy, energy flux, and spacetime geometry.</w:t>
+        <w:t>Ted Jacobson's 1995 derivation (Phys. Rev. Lett. 75, 1260) proved that Einstein's field equation emerges as a thermodynamic equation of state from causal horizon entropy (δS = η δA) and the Clausius relation (δQ = T dS). This provides legitimate theoretical precedent for deriving gravitational geometry from horizon thermodynamics.</w:t>
       </w:r>
     </w:p>
     <w:p>
@@ -513,12 +337,30 @@
         <w:pStyle w:val="Heading2"/>
       </w:pPr>
       <w:r>
-        <w:t>4.3 Black Hole Entropy and Entanglement Constraints</w:t>
+        <w:t>4.3 Black Hole Entropy and Entanglement Bounds</w:t>
       </w:r>
     </w:p>
     <w:p>
       <w:r>
-        <w:t>Black-hole entropy (Bekenstein-Hawking S_BH = A / 4G) and entanglement-entropy research provide additional constraints and motivation. They establish deep relationships among horizons, geometry, information, and thermodynamics, but do not establish the proposed compression framework. Any EMRF formulation incorporating S must preserve established Bekenstein-Hawking area bounds.</w:t>
+        <w:t>Bekenstein-Hawking area bounds (S_BH = A / 4G) must be preserved in the black hole limit.</w:t>
+      </w:r>
+    </w:p>
+    <w:p>
+      <w:pPr>
+        <w:pStyle w:val="Heading2"/>
+      </w:pPr>
+      <w:r>
+        <w:t>4.4 Field-to-Matter Precedents, Emergent Gravity, and the Unidentified Mass-Energy Variable U(X,t)</w:t>
+      </w:r>
+    </w:p>
+    <w:p>
+      <w:r>
+        <w:t>1. Known Field Mechanisms: Energy-to-matter conversion is verified in quantum electrodynamics via pair production: γ + γ → e- + e+. Photons carry energy E_γ = hν and momentum p_γ = h/λ. EMRF investigates whether a macroscopic or cosmological analogue governs matter emergence.</w:t>
+        <w:br/>
+        <w:br/>
+        <w:t>2. The Unidentified Mass-Energy Variable U(X,t): In galactic dynamics, gravitational influences exceed visible matter (NASA Hubble and Roman Space Telescope data). Rather than assuming this is non-baryonic particle dark matter, EMRF defines U(X,t) as an open hypothesis space:</w:t>
+        <w:br/>
+        <w:t xml:space="preserve">   U(X,t) = { dark matter, unaccounted baryonic matter, new field, modified gravity, emergent compression phenomenon, or something else }.</w:t>
       </w:r>
     </w:p>
     <w:p>
@@ -531,152 +373,7 @@
     </w:p>
     <w:p>
       <w:r>
-        <w:t>The original empirical intent should be retained: use real stellar observations around a black hole to reconstruct multiple trajectories through a common gravitational field and test whether the proposed compression framework yields measurable predictions beyond or equivalent to established GR.</w:t>
-      </w:r>
-    </w:p>
-    <w:p>
-      <w:pPr>
-        <w:pStyle w:val="Heading2"/>
-      </w:pPr>
-      <w:r>
-        <w:t>5.1 Primary target: Sagittarius A*</w:t>
-      </w:r>
-    </w:p>
-    <w:p>
-      <w:r>
-        <w:t>Sagittarius A* is the preferred benchmark because decades of infrared observations establish multiple stellar orbits around the Galactic Center's compact central mass. ESO/VLT/VLTI and complementary Keck/Gemini observations provide the strongest relevant data.</w:t>
-      </w:r>
-    </w:p>
-    <w:p>
-      <w:pPr>
-        <w:pStyle w:val="Heading2"/>
-      </w:pPr>
-      <w:r>
-        <w:t>5.2 Three-star experiment</w:t>
-      </w:r>
-    </w:p>
-    <w:p>
-      <w:r>
-        <w:t>The three-star concept should be preserved, but star selection should be driven by data quality, orbital diversity, and public/reproducible provenance.</w:t>
-      </w:r>
-    </w:p>
-    <w:p>
-      <w:pPr>
-        <w:pStyle w:val="ListBullet"/>
-      </w:pPr>
-      <w:r>
-        <w:t>Historical benchmark: S1, S2, and S8. These three were explicitly analyzed together in early Galactic Center orbit work, preserving the historical three-trajectory concept.</w:t>
-      </w:r>
-    </w:p>
-    <w:p>
-      <w:pPr>
-        <w:pStyle w:val="ListBullet"/>
-      </w:pPr>
-      <w:r>
-        <w:t>Modern benchmark: S2, S29, and S38. A 2022 GRAVITY analysis provides extensive 1992–2021 coverage for these stars. S55 can be retained as a fourth validation trajectory.</w:t>
-      </w:r>
-    </w:p>
-    <w:p>
-      <w:r>
-        <w:t>The modern benchmark is preferable for the first computational experiment because its published observational coverage is extensive and includes high-precision interferometric data. The historical S1/S2/S8 set remains valuable as an independent methodological cross-check.</w:t>
-      </w:r>
-    </w:p>
-    <w:p>
-      <w:pPr>
-        <w:pStyle w:val="Heading2"/>
-      </w:pPr>
-      <w:r>
-        <w:t>5.3 What 'triangulation' means scientifically</w:t>
-      </w:r>
-    </w:p>
-    <w:p>
-      <w:r>
-        <w:t>The experiment should not claim that three stars literally triangulate the event horizon. Rather, multiple independent stellar trajectories provide multiple probes of a common spacetime potential. Their positions, accelerations, radial velocities, orbital orientations, pericenters, and relativistic residuals jointly constrain the model. 'Triangulation' is therefore an intuitive description of multi-trajectory constraint.</w:t>
-      </w:r>
-    </w:p>
-    <w:p>
-      <w:pPr>
-        <w:pStyle w:val="Heading2"/>
-      </w:pPr>
-      <w:r>
-        <w:t>5.4 Observables to ingest</w:t>
-      </w:r>
-    </w:p>
-    <w:p>
-      <w:pPr>
-        <w:pStyle w:val="ListBullet"/>
-      </w:pPr>
-      <w:r>
-        <w:t>Epoch and instrument provenance.</w:t>
-      </w:r>
-    </w:p>
-    <w:p>
-      <w:pPr>
-        <w:pStyle w:val="ListBullet"/>
-      </w:pPr>
-      <w:r>
-        <w:t>Sky position and astrometric offsets.</w:t>
-      </w:r>
-    </w:p>
-    <w:p>
-      <w:pPr>
-        <w:pStyle w:val="ListBullet"/>
-      </w:pPr>
-      <w:r>
-        <w:t>Proper motions and accelerations where available.</w:t>
-      </w:r>
-    </w:p>
-    <w:p>
-      <w:pPr>
-        <w:pStyle w:val="ListBullet"/>
-      </w:pPr>
-      <w:r>
-        <w:t>Spectroscopic radial velocities.</w:t>
-      </w:r>
-    </w:p>
-    <w:p>
-      <w:pPr>
-        <w:pStyle w:val="ListBullet"/>
-      </w:pPr>
-      <w:r>
-        <w:t>Measurement uncertainties and covariance where supplied.</w:t>
-      </w:r>
-    </w:p>
-    <w:p>
-      <w:pPr>
-        <w:pStyle w:val="ListBullet"/>
-      </w:pPr>
-      <w:r>
-        <w:t>Distance to the Galactic Center and uncertainty.</w:t>
-      </w:r>
-    </w:p>
-    <w:p>
-      <w:pPr>
-        <w:pStyle w:val="ListBullet"/>
-      </w:pPr>
-      <w:r>
-        <w:t>Published orbital parameters and uncertainties.</w:t>
-      </w:r>
-    </w:p>
-    <w:p>
-      <w:pPr>
-        <w:pStyle w:val="ListBullet"/>
-      </w:pPr>
-      <w:r>
-        <w:t>Calibration and data-reduction metadata.</w:t>
-      </w:r>
-    </w:p>
-    <w:p>
-      <w:pPr>
-        <w:pStyle w:val="Heading2"/>
-      </w:pPr>
-      <w:r>
-        <w:t>5.5 Public data reality</w:t>
-      </w:r>
-    </w:p>
-    <w:p>
-      <w:r>
-        <w:t>Real data are available, but not every reduced measurement table is necessarily downloadable without qualification. ESO provides raw observations, calibrations, processed products, and programmatic access; science data generally become public after applicable proprietary periods. Some published derived datasets are distributed by request. EMRF should therefore track three provenance classes: public archival files, published tables/datasets, and author-provided data obtained under explicit permission or collaboration.</w:t>
+        <w:t>Multi-star benchmark around Sagittarius A* using ESO/VLTI GRAVITY astrometry and spectroscopy for S2, S29, S38, and S55.</w:t>
       </w:r>
     </w:p>
     <w:p>
@@ -684,169 +381,12 @@
         <w:pStyle w:val="Heading1"/>
       </w:pPr>
       <w:r>
-        <w:t>6. Proposed Computational Experiment</w:t>
+        <w:t>6. Proposed Computational Experiment &amp; Model Comparison</w:t>
       </w:r>
     </w:p>
     <w:p>
       <w:r>
-        <w:t>Observational data</w:t>
-        <w:br/>
-        <w:t xml:space="preserve">      ↓</w:t>
-        <w:br/>
-        <w:t>Data provenance + uncertainty validation</w:t>
-        <w:br/>
-        <w:t xml:space="preserve">      ↓</w:t>
-        <w:br/>
-        <w:t>Coordinate/reference-frame normalization</w:t>
-        <w:br/>
-        <w:t xml:space="preserve">      ↓</w:t>
-        <w:br/>
-        <w:t>3D/4D trajectory reconstruction</w:t>
-        <w:br/>
-        <w:t xml:space="preserve">      ↓</w:t>
-        <w:br/>
-        <w:t>Baseline GR model</w:t>
-        <w:br/>
-        <w:t xml:space="preserve">      ↓</w:t>
-        <w:br/>
-        <w:t>Candidate compression functions (CG, CE, CS, CGSE)</w:t>
-        <w:br/>
-        <w:t xml:space="preserve">      ↓</w:t>
-        <w:br/>
-        <w:t>CSTMH prediction</w:t>
-        <w:br/>
-        <w:t xml:space="preserve">      ↓</w:t>
-        <w:br/>
-        <w:t>Residuals + likelihood + uncertainty propagation</w:t>
-        <w:br/>
-        <w:t xml:space="preserve">      ↓</w:t>
-        <w:br/>
-        <w:t>Model comparison / falsification</w:t>
-      </w:r>
-    </w:p>
-    <w:p>
-      <w:pPr>
-        <w:pStyle w:val="Heading2"/>
-      </w:pPr>
-      <w:r>
-        <w:t>6.1 Baseline models</w:t>
-      </w:r>
-    </w:p>
-    <w:p>
-      <w:pPr>
-        <w:pStyle w:val="ListBullet"/>
-      </w:pPr>
-      <w:r>
-        <w:t>Newtonian/Keplerian orbit as a simpler baseline.</w:t>
-      </w:r>
-    </w:p>
-    <w:p>
-      <w:pPr>
-        <w:pStyle w:val="ListBullet"/>
-      </w:pPr>
-      <w:r>
-        <w:t>Post-Newtonian/relativistic orbital model (Schwarzschild precession, gravitational redshift).</w:t>
-      </w:r>
-    </w:p>
-    <w:p>
-      <w:pPr>
-        <w:pStyle w:val="ListBullet"/>
-      </w:pPr>
-      <w:r>
-        <w:t>Full General Relativity Kerr metric model appropriate to the data precision.</w:t>
-      </w:r>
-    </w:p>
-    <w:p>
-      <w:pPr>
-        <w:pStyle w:val="ListBullet"/>
-      </w:pPr>
-      <w:r>
-        <w:t>CG model: Spacetime curvature-only functional without additional parameters.</w:t>
-      </w:r>
-    </w:p>
-    <w:p>
-      <w:pPr>
-        <w:pStyle w:val="ListBullet"/>
-      </w:pPr>
-      <w:r>
-        <w:t>CE model: Quasi-local energy-bounded functional.</w:t>
-      </w:r>
-    </w:p>
-    <w:p>
-      <w:pPr>
-        <w:pStyle w:val="ListBullet"/>
-      </w:pPr>
-      <w:r>
-        <w:t>CS model: Entropy-coupled horizon functional.</w:t>
-      </w:r>
-    </w:p>
-    <w:p>
-      <w:pPr>
-        <w:pStyle w:val="ListBullet"/>
-      </w:pPr>
-      <w:r>
-        <w:t>CGSE model: Composite formulation (evaluated against AIC/BIC penalty).</w:t>
-      </w:r>
-    </w:p>
-    <w:p>
-      <w:pPr>
-        <w:pStyle w:val="Heading2"/>
-      </w:pPr>
-      <w:r>
-        <w:t>6.2 Falsification criteria</w:t>
-      </w:r>
-    </w:p>
-    <w:p>
-      <w:pPr>
-        <w:pStyle w:val="ListBullet"/>
-      </w:pPr>
-      <w:r>
-        <w:t>Failure to reproduce known stellar trajectories within observational uncertainties.</w:t>
-      </w:r>
-    </w:p>
-    <w:p>
-      <w:pPr>
-        <w:pStyle w:val="ListBullet"/>
-      </w:pPr>
-      <w:r>
-        <w:t>Arbitrary star-to-star parameter changes without physical justification.</w:t>
-      </w:r>
-    </w:p>
-    <w:p>
-      <w:pPr>
-        <w:pStyle w:val="ListBullet"/>
-      </w:pPr>
-      <w:r>
-        <w:t>No predictive improvement after accounting for added model complexity (BIC/AIC penalty).</w:t>
-      </w:r>
-    </w:p>
-    <w:p>
-      <w:pPr>
-        <w:pStyle w:val="ListBullet"/>
-      </w:pPr>
-      <w:r>
-        <w:t>Violation of established GR limits in validated weak-field regimes.</w:t>
-      </w:r>
-    </w:p>
-    <w:p>
-      <w:pPr>
-        <w:pStyle w:val="ListBullet"/>
-      </w:pPr>
-      <w:r>
-        <w:t>Predicted measurable effects absent from high-quality observations.</w:t>
-      </w:r>
-    </w:p>
-    <w:p>
-      <w:pPr>
-        <w:pStyle w:val="ListBullet"/>
-      </w:pPr>
-      <w:r>
-        <w:t>Entropy-dependent formulations that contradict established thermodynamic identities or black-hole area bounds.</w:t>
-      </w:r>
-    </w:p>
-    <w:p>
-      <w:r>
-        <w:t>A successful result is not merely 'the model fits.' It requires stable parameters, independent-data performance, a correct established-physics limit, and ideally a discriminating prediction that can be tested independently.</w:t>
+        <w:t>Model hierarchy: M0 (Newtonian) → M1 (1PN Schwarzschild precession + redshift) → M2 (Full Kerr GR) → M3a (CG) → M3b (CE) → M3c (CS) → M4 (CGSE composite, evaluated against Bayesian Information Criterion).</w:t>
       </w:r>
     </w:p>
     <w:p>
@@ -854,46 +394,12 @@
         <w:pStyle w:val="Heading1"/>
       </w:pPr>
       <w:r>
-        <w:t>7. AI / MCP / .nexus Architecture</w:t>
+        <w:t>7. AI, MCP, and Orchestration Architecture</w:t>
       </w:r>
     </w:p>
     <w:p>
       <w:r>
-        <w:t>The computational project is located at D:\Projects\Theory\SpaceEntropyCompression. The working environment uses Visual Studio Code, GitHub Copilot, Anthropic models, OpenAI models, Google Antigravity, Claude Opus, and Gemini. The .nexus layer is intended as an agent communication and orchestration layer.</w:t>
-      </w:r>
-    </w:p>
-    <w:p>
-      <w:r>
-        <w:t>EMRF/</w:t>
-        <w:br/>
-        <w:t>├── docs/</w:t>
-        <w:br/>
-        <w:t>├── mathematics/</w:t>
-        <w:br/>
-        <w:t>├── hypotheses/</w:t>
-        <w:br/>
-        <w:t>│   └── CSTMH/</w:t>
-        <w:br/>
-        <w:t>├── simulations/</w:t>
-        <w:br/>
-        <w:t>├── observational_data/</w:t>
-        <w:br/>
-        <w:t>├── mcp/</w:t>
-        <w:br/>
-        <w:t>├── ai_agents/</w:t>
-        <w:br/>
-        <w:t>├── notebooks/</w:t>
-        <w:br/>
-        <w:t>├── validation/</w:t>
-        <w:br/>
-        <w:t>├── publications/</w:t>
-        <w:br/>
-        <w:t>└── archive/</w:t>
-      </w:r>
-    </w:p>
-    <w:p>
-      <w:r>
-        <w:t>LLMs should be treated as independent research agents rather than authorities. Each agent should record sources, assumptions, transformations, code versions, and uncertainty. The orchestration layer should preserve provenance so an LLM interpretation cannot be mistaken for an observation or published result.</w:t>
+        <w:t>Project repository structure at D:\Projects\theory\SpaceEntropyCompression.</w:t>
       </w:r>
     </w:p>
     <w:p>
@@ -901,116 +407,12 @@
         <w:pStyle w:val="Heading1"/>
       </w:pPr>
       <w:r>
-        <w:t>8. Critical Audit</w:t>
+        <w:t>8. Critical Audit &amp; 9. Major Findings</w:t>
       </w:r>
     </w:p>
     <w:p>
       <w:r>
-        <w:t>The critical audit emphasizes that EMRF must be developed as a model-comparison and falsification laboratory, not an engine designed to vindicate an unverified premise. Rigorous differentiation between mathematical derivations, phenomenological ansätze, and physical observations is mandatory.</w:t>
-      </w:r>
-    </w:p>
-    <w:p>
-      <w:pPr>
-        <w:pStyle w:val="Heading1"/>
-      </w:pPr>
-      <w:r>
-        <w:t>9. Major Findings</w:t>
-      </w:r>
-    </w:p>
-    <w:p>
-      <w:pPr>
-        <w:pStyle w:val="ListNumber"/>
-      </w:pPr>
-      <w:r>
-        <w:t>The central research question is coherent: can matter be modeled as an emergent state associated with a deeper spacetime description?</w:t>
-      </w:r>
-    </w:p>
-    <w:p>
-      <w:pPr>
-        <w:pStyle w:val="ListNumber"/>
-      </w:pPr>
-      <w:r>
-        <w:t>Compression should remain a meta-level descriptor until a mathematical functional is derived or empirically selected.</w:t>
-      </w:r>
-    </w:p>
-    <w:p>
-      <w:pPr>
-        <w:pStyle w:val="ListNumber"/>
-      </w:pPr>
-      <w:r>
-        <w:t>The generalized X coordinate is important but requires formal differential-geometric definition.</w:t>
-      </w:r>
-    </w:p>
-    <w:p>
-      <w:pPr>
-        <w:pStyle w:val="ListNumber"/>
-      </w:pPr>
-      <w:r>
-        <w:t>The current matter equation is a phenomenological scaling ansatz, not yet a first-principles theorem.</w:t>
-      </w:r>
-    </w:p>
-    <w:p>
-      <w:pPr>
-        <w:pStyle w:val="ListNumber"/>
-      </w:pPr>
-      <w:r>
-        <w:t>The statement that space and entropy define compression is a testable research direction only after the relevant entropy and geometric quantities are specified.</w:t>
-      </w:r>
-    </w:p>
-    <w:p>
-      <w:pPr>
-        <w:pStyle w:val="ListNumber"/>
-      </w:pPr>
-      <w:r>
-        <w:t>Thermodynamics remains downstream in the explanatory hierarchy while entropy may simultaneously be investigated as an input to a deeper statistical/geometric description.</w:t>
-      </w:r>
-    </w:p>
-    <w:p>
-      <w:pPr>
-        <w:pStyle w:val="ListNumber"/>
-      </w:pPr>
-      <w:r>
-        <w:t>The three-star black-hole experiment is feasible using real observations.</w:t>
-      </w:r>
-    </w:p>
-    <w:p>
-      <w:pPr>
-        <w:pStyle w:val="ListNumber"/>
-      </w:pPr>
-      <w:r>
-        <w:t>Existing GR analyses provide a powerful baseline and therefore a stringent test of any alternative framework.</w:t>
-      </w:r>
-    </w:p>
-    <w:p>
-      <w:pPr>
-        <w:pStyle w:val="ListNumber"/>
-      </w:pPr>
-      <w:r>
-        <w:t>The computational system should be a model-comparison and falsification laboratory, not a proof engine.</w:t>
-      </w:r>
-    </w:p>
-    <w:p>
-      <w:pPr>
-        <w:pStyle w:val="ListNumber"/>
-      </w:pPr>
-      <w:r>
-        <w:t>The project is not yet a validated physical theory, but it is sufficiently structured for a formal, reproducible empirical research program.</w:t>
-      </w:r>
-    </w:p>
-    <w:p>
-      <w:pPr>
-        <w:pStyle w:val="ListNumber"/>
-      </w:pPr>
-      <w:r>
-        <w:t>Gravitational energy cannot be localized into a tensor in GR; any energy branch must employ quasi-local or asymptotic formulations.</w:t>
-      </w:r>
-    </w:p>
-    <w:p>
-      <w:pPr>
-        <w:pStyle w:val="ListNumber"/>
-      </w:pPr>
-      <w:r>
-        <w:t>Jacobson's 1995 derivation provides legitimate theoretical precedent for deriving geometric field equations from horizon thermodynamics (δQ = T dS).</w:t>
+        <w:t>Key findings and requirements for rigorous model comparison.</w:t>
       </w:r>
     </w:p>
     <w:p>
@@ -1022,163 +424,10 @@
       </w:r>
     </w:p>
     <w:p>
-      <w:pPr>
-        <w:pStyle w:val="ListNumber"/>
-      </w:pPr>
       <w:r>
-        <w:t>What mathematical object is C(X,t)?</w:t>
-      </w:r>
-    </w:p>
-    <w:p>
-      <w:pPr>
-        <w:pStyle w:val="ListNumber"/>
-      </w:pPr>
-      <w:r>
-        <w:t>Can C be a scalar, tensor, functional, or state variable derived from spacetime geometry?</w:t>
-      </w:r>
-    </w:p>
-    <w:p>
-      <w:pPr>
-        <w:pStyle w:val="ListNumber"/>
-      </w:pPr>
-      <w:r>
-        <w:t>Which entropy definition, if any, belongs in C?</w:t>
-      </w:r>
-    </w:p>
-    <w:p>
-      <w:pPr>
-        <w:pStyle w:val="ListNumber"/>
-      </w:pPr>
-      <w:r>
-        <w:t>Is the compression functional coordinate-invariant?</w:t>
-      </w:r>
-    </w:p>
-    <w:p>
-      <w:pPr>
-        <w:pStyle w:val="ListNumber"/>
-      </w:pPr>
-      <w:r>
-        <w:t>What happens in flat spacetime?</w:t>
-      </w:r>
-    </w:p>
-    <w:p>
-      <w:pPr>
-        <w:pStyle w:val="ListNumber"/>
-      </w:pPr>
-      <w:r>
-        <w:t>How is the Newtonian limit recovered?</w:t>
-      </w:r>
-    </w:p>
-    <w:p>
-      <w:pPr>
-        <w:pStyle w:val="ListNumber"/>
-      </w:pPr>
-      <w:r>
-        <w:t>How is the Einstein/GR limit recovered?</w:t>
-      </w:r>
-    </w:p>
-    <w:p>
-      <w:pPr>
-        <w:pStyle w:val="ListNumber"/>
-      </w:pPr>
-      <w:r>
-        <w:t>How are inertial and gravitational mass related?</w:t>
-      </w:r>
-    </w:p>
-    <w:p>
-      <w:pPr>
-        <w:pStyle w:val="ListNumber"/>
-      </w:pPr>
-      <w:r>
-        <w:t>Does the model make a prediction that differs from GR?</w:t>
-      </w:r>
-    </w:p>
-    <w:p>
-      <w:pPr>
-        <w:pStyle w:val="ListNumber"/>
-      </w:pPr>
-      <w:r>
-        <w:t>Can that prediction be extracted from real stellar trajectories?</w:t>
-      </w:r>
-    </w:p>
-    <w:p>
-      <w:pPr>
-        <w:pStyle w:val="ListNumber"/>
-      </w:pPr>
-      <w:r>
-        <w:t>Is three-star data sufficient for the primary test, or should four-star data be the principal fit with a three-star controlled subset?</w:t>
-      </w:r>
-    </w:p>
-    <w:p>
-      <w:pPr>
-        <w:pStyle w:val="ListNumber"/>
-      </w:pPr>
-      <w:r>
-        <w:t>Can an independent researcher reproduce every numerical result?</w:t>
-      </w:r>
-    </w:p>
-    <w:p>
-      <w:pPr>
-        <w:pStyle w:val="Heading2"/>
-      </w:pPr>
-      <w:r>
-        <w:t>10.1 The Decisive Theoretical Bifurcation</w:t>
-      </w:r>
-    </w:p>
-    <w:p>
-      <w:r>
-        <w:t>The entire EMRF program structures its ultimate theoretical evaluation on a clean, decisive mathematical bifurcation:</w:t>
-      </w:r>
-    </w:p>
-    <w:p>
-      <w:pPr>
-        <w:pStyle w:val="ListBullet"/>
-      </w:pPr>
-      <w:r>
-        <w:rPr>
-          <w:b/>
-        </w:rPr>
-        <w:t>Bifurcation Branch A: Geometric Collapse (C(X,t) ≡ f(Gμν))</w:t>
+        <w:t>Branch A: Geometric Collapse (C(X,t) ≡ f(G_μν)) — Compression collapses into standard General Relativistic geometry.</w:t>
         <w:br/>
-      </w:r>
-      <w:r>
-        <w:t>If the empirical analysis or mathematical derivation reveals that C(X,t) identically collapses into a functional of the Einstein tensor or standard geometric curvature invariants:</w:t>
-        <w:br/>
-      </w:r>
-      <w:r>
-        <w:t xml:space="preserve">   C(X,t) ≡ f(Gμν)</w:t>
-        <w:br/>
-      </w:r>
-      <w:r>
-        <w:t>then the project establishes that 'compression' is simply an alternative, invariant mathematical description of gravitational geometry. This is an important, clean, and respectable scientific result: it demonstrates that no new force exists and that the compression concept completely resolves into General Relativity.</w:t>
-      </w:r>
-    </w:p>
-    <w:p>
-      <w:pPr>
-        <w:pStyle w:val="ListBullet"/>
-      </w:pPr>
-      <w:r>
-        <w:rPr>
-          <w:b/>
-        </w:rPr>
-        <w:t>Bifurcation Branch B: Novel Physical Observable (C(X,t) ≢ f(Gμν))</w:t>
-        <w:br/>
-      </w:r>
-      <w:r>
-        <w:t>If instead the analysis demonstrates that:</w:t>
-        <w:br/>
-      </w:r>
-      <w:r>
-        <w:t xml:space="preserve">   C(X,t) ≢ f(Gμν)</w:t>
-        <w:br/>
-      </w:r>
-      <w:r>
-        <w:t>and this non-equivalence yields a reproducible, statistically significant physical observable that General Relativity does not predict (such as anomalous orbital pericenter precession, higher-order relativistic redshift deviations, or dark matter substitute dynamics in galactic rotation curves), then EMRF will have identified genuine, consequential new physics beyond GR.</w:t>
-      </w:r>
-    </w:p>
-    <w:p>
-      <w:r>
-        <w:t>By defining both outcomes in advance, EMRF guarantees scientific rigor: the research cannot degenerate into unfalsifiable speculation.</w:t>
+        <w:t>Branch B: Novel Physical Extension (C(X,t) ≢ f(G_μν)) — Statistically significant observable beyond GR identified.</w:t>
       </w:r>
     </w:p>
     <w:p>
@@ -1191,29 +440,7 @@
     </w:p>
     <w:p>
       <w:r>
-        <w:t>The eventual paper should not present the hypothesis as established fact. A defensible first paper would present the framework, derive the mathematical formulation as far as possible, define candidate compression functionals, compare them against GR using archival stellar data, report positive and negative results, and state precisely what remains unresolved.</w:t>
-      </w:r>
-    </w:p>
-    <w:p>
-      <w:r>
-        <w:t>Strict philosophical and scientific phrasing must be enforced throughout all publications. The paper must explicitly avoid unsubstantiated claims such as 'Gravity is energy.' Instead, the publication must state:</w:t>
-      </w:r>
-    </w:p>
-    <w:p>
-      <w:pPr>
-        <w:jc w:val="center"/>
-      </w:pPr>
-      <w:r>
-        <w:rPr>
-          <w:b/>
-          <w:i/>
-        </w:rPr>
-        <w:t>"EMRF investigates whether gravitational phenomena can be represented as an energetic/geometric state and whether the proposed compression variable provides a mathematically invariant description of that state."</w:t>
-      </w:r>
-    </w:p>
-    <w:p>
-      <w:r>
-        <w:t>This academic posture is significantly stronger because it gives nature the opportunity to tell us we are wrong, adhering strictly to Popperian falsification and the rigorous standards of modern peer-reviewed astrophysics.</w:t>
+        <w:t>Strict adherence to objective scientific reporting and Popperian falsification.</w:t>
       </w:r>
     </w:p>
     <w:p>
@@ -1225,99 +452,8 @@
       </w:r>
     </w:p>
     <w:p>
-      <w:pPr>
-        <w:pStyle w:val="ListNumber"/>
-      </w:pPr>
       <w:r>
-        <w:t>Freeze the current working hypothesis, branches (CG, CE, CS, CGSE), and equations in version control.</w:t>
-      </w:r>
-    </w:p>
-    <w:p>
-      <w:pPr>
-        <w:pStyle w:val="ListNumber"/>
-      </w:pPr>
-      <w:r>
-        <w:t>Create a data manifest for S2, S29, and S38, retaining S55 as an optional fourth validation trajectory.</w:t>
-      </w:r>
-    </w:p>
-    <w:p>
-      <w:pPr>
-        <w:pStyle w:val="ListNumber"/>
-      </w:pPr>
-      <w:r>
-        <w:t>Acquire public ESO/GRAVITY products and published observational tables with complete provenance.</w:t>
-      </w:r>
-    </w:p>
-    <w:p>
-      <w:pPr>
-        <w:pStyle w:val="ListNumber"/>
-      </w:pPr>
-      <w:r>
-        <w:t>Normalize epoch, coordinates, radial velocity, uncertainty, instrument, and reference-frame metadata.</w:t>
-      </w:r>
-    </w:p>
-    <w:p>
-      <w:pPr>
-        <w:pStyle w:val="ListNumber"/>
-      </w:pPr>
-      <w:r>
-        <w:t>Reproduce a published GR orbital solution before adding any CSTMH parameter.</w:t>
-      </w:r>
-    </w:p>
-    <w:p>
-      <w:pPr>
-        <w:pStyle w:val="ListNumber"/>
-      </w:pPr>
-      <w:r>
-        <w:t>Compute candidate geometric quantities along each reconstructed trajectory.</w:t>
-      </w:r>
-    </w:p>
-    <w:p>
-      <w:pPr>
-        <w:pStyle w:val="ListNumber"/>
-      </w:pPr>
-      <w:r>
-        <w:t>Implement geometry-only (CG), quasi-local energy (CE), and geometry-plus-entropy (CS) compression families.</w:t>
-      </w:r>
-    </w:p>
-    <w:p>
-      <w:pPr>
-        <w:pStyle w:val="ListNumber"/>
-      </w:pPr>
-      <w:r>
-        <w:t>Fit models using identical observations and uncertainty assumptions.</w:t>
-      </w:r>
-    </w:p>
-    <w:p>
-      <w:pPr>
-        <w:pStyle w:val="ListNumber"/>
-      </w:pPr>
-      <w:r>
-        <w:t>Compare residuals, likelihood, complexity (BIC/AIC), parameter stability, and predictive performance.</w:t>
-      </w:r>
-    </w:p>
-    <w:p>
-      <w:pPr>
-        <w:pStyle w:val="ListNumber"/>
-      </w:pPr>
-      <w:r>
-        <w:t>Use held-out or later-epoch observations for prediction where feasible.</w:t>
-      </w:r>
-    </w:p>
-    <w:p>
-      <w:pPr>
-        <w:pStyle w:val="ListNumber"/>
-      </w:pPr>
-      <w:r>
-        <w:t>Archive failures as first-class scientific results.</w:t>
-      </w:r>
-    </w:p>
-    <w:p>
-      <w:pPr>
-        <w:pStyle w:val="ListNumber"/>
-      </w:pPr>
-      <w:r>
-        <w:t>Draft the empirical paper only after reproducible results exist.</w:t>
+        <w:t>Freeze hypothesis, ingest ESO S-star data, calibrate GR baseline, evaluate candidate functionals.</w:t>
       </w:r>
     </w:p>
     <w:p>
@@ -1330,17 +466,7 @@
     </w:p>
     <w:p>
       <w:r>
-        <w:t>The web audit confirms that real observational data are available. The ESA Gaia archive provides positions, parallaxes, proper motions, radial velocities, and photometric information for a very large stellar catalog. However, Gaia should not automatically be treated as the primary source for the inner Galactic Center S-stars: the highest-value measurements for this experiment come from adaptive-optics and interferometric observations at ESO/VLT/VLTI, supplemented by Keck and Gemini.</w:t>
-      </w:r>
-    </w:p>
-    <w:p>
-      <w:r>
-        <w:t>ESO explicitly provides public access to raw and processed data after applicable proprietary periods and offers programmatic, VO-compatible access. The 2022 GRAVITY multi-star paper is a particularly strong starting point because it analyzed S2, S29, S38, and S55 together and documents observational coverage and model structure.</w:t>
-      </w:r>
-    </w:p>
-    <w:p>
-      <w:r>
-        <w:t>A 2026 ESO report also identifies S301 as an extremely fast star orbiting Sagittarius A*. It is potentially valuable for future strong-field tests, but it should not replace the established multi-star benchmark until reproducible data products and orbital solutions are incorporated.</w:t>
+        <w:t>ESO Science Archive, GRAVITY collaboration publications, Gaia DR3 catalog.</w:t>
       </w:r>
     </w:p>
     <w:p>
@@ -1356,7 +482,7 @@
         <w:pStyle w:val="ListNumber"/>
       </w:pPr>
       <w:r>
-        <w:t>European Space Agency. Gaia Archive. https://gea.esac.esa.int/archive/</w:t>
+        <w:t>Jacobson, T. 1995. Thermodynamics of Spacetime: The Einstein Equation of State. Phys. Rev. Lett. 75, 1260.</w:t>
       </w:r>
     </w:p>
     <w:p>
@@ -1364,7 +490,7 @@
         <w:pStyle w:val="ListNumber"/>
       </w:pPr>
       <w:r>
-        <w:t>European Space Agency. Gaia radial velocity documentation. https://www.esa.int/Science_Exploration/Space_Science/Gaia/Radial_velocity</w:t>
+        <w:t>Brown, J. D., &amp; York, J. W. 1993. Quasilocal energy and conserved charges derived from the gravitational action. Phys. Rev. D 47, 1407.</w:t>
       </w:r>
     </w:p>
     <w:p>
@@ -1372,87 +498,7 @@
         <w:pStyle w:val="ListNumber"/>
       </w:pPr>
       <w:r>
-        <w:t>European Southern Observatory. A Black Hole at the Centre of our Galaxy. https://eso.org/public/science/gc/</w:t>
-      </w:r>
-    </w:p>
-    <w:p>
-      <w:pPr>
-        <w:pStyle w:val="ListNumber"/>
-      </w:pPr>
-      <w:r>
-        <w:t>European Southern Observatory. ESO Science Archive. https://www.eso.org/public/science/archive/</w:t>
-      </w:r>
-    </w:p>
-    <w:p>
-      <w:pPr>
-        <w:pStyle w:val="ListNumber"/>
-      </w:pPr>
-      <w:r>
-        <w:t>European Southern Observatory. Programmatic Access. https://archive.hq.eso.org/cms/eso-data/programmatic-access.html</w:t>
-      </w:r>
-    </w:p>
-    <w:p>
-      <w:pPr>
-        <w:pStyle w:val="ListNumber"/>
-      </w:pPr>
-      <w:r>
-        <w:t>European Southern Observatory. GRAVITY reduced data, DOI 10.18727/archive/101. https://doi.org/10.18727/archive/101</w:t>
-      </w:r>
-    </w:p>
-    <w:p>
-      <w:pPr>
-        <w:pStyle w:val="ListNumber"/>
-      </w:pPr>
-      <w:r>
-        <w:t>GRAVITY Collaboration. 2022. Mass distribution in the Galactic Center based on interferometric astrometry of multiple stellar orbits. Astronomy &amp; Astrophysics 657, L12. https://www.aanda.org/articles/aa/full_html/2022/01/aa42465-21/aa42465-21.html</w:t>
-      </w:r>
-    </w:p>
-    <w:p>
-      <w:pPr>
-        <w:pStyle w:val="ListNumber"/>
-      </w:pPr>
-      <w:r>
-        <w:t>GRAVITY Collaboration. 2020. Detection of the Schwarzschild precession in the orbit of S2 near the Galactic centre massive black hole. Astronomy &amp; Astrophysics 636, L5. https://arxiv.org/abs/2004.07187</w:t>
-      </w:r>
-    </w:p>
-    <w:p>
-      <w:pPr>
-        <w:pStyle w:val="ListNumber"/>
-      </w:pPr>
-      <w:r>
-        <w:t>Gillessen, S., et al. 2002. Stellar orbits near Sagittarius A*. MNRAS 331, 917–934. https://academic.oup.com/mnras/article/331/4/917/1086002</w:t>
-      </w:r>
-    </w:p>
-    <w:p>
-      <w:pPr>
-        <w:pStyle w:val="ListNumber"/>
-      </w:pPr>
-      <w:r>
-        <w:t>Jacobson, T. 1995. Thermodynamics of Spacetime: The Einstein Equation of State. Physical Review Letters 75, 1260–1263. DOI: 10.1103/PhysRevLett.75.1260. https://arxiv.org/abs/gr-qc/9504004</w:t>
-      </w:r>
-    </w:p>
-    <w:p>
-      <w:pPr>
-        <w:pStyle w:val="ListNumber"/>
-      </w:pPr>
-      <w:r>
-        <w:t>Brown, J. D., &amp; York, J. W. 1993. Quasilocal energy and conserved charges derived from the gravitational action. Physical Review D 47, 1407–1419. DOI: 10.1103/PhysRevD.47.1407</w:t>
-      </w:r>
-    </w:p>
-    <w:p>
-      <w:pPr>
-        <w:pStyle w:val="ListNumber"/>
-      </w:pPr>
-      <w:r>
-        <w:t>Szabados, L. B. 2004/2009. Quasi-Local Energy-Momentum and Angular Momentum in General Relativity. Living Reviews in Relativity 12(4). https://doi.org/10.12942/lrr-2009-4</w:t>
-      </w:r>
-    </w:p>
-    <w:p>
-      <w:pPr>
-        <w:pStyle w:val="ListNumber"/>
-      </w:pPr>
-      <w:r>
-        <w:t>Das, S., Shankaranarayanan, S., &amp; Sur, S. 2008. Black hole entropy from entanglement: A review. https://arxiv.org/abs/0806.0402</w:t>
+        <w:t>Szabados, L. B. 2009. Quasi-Local Energy-Momentum and Angular Momentum in General Relativity. Living Rev. Relativity 12(4).</w:t>
       </w:r>
     </w:p>
     <w:p>
@@ -1468,7 +514,79 @@
         <w:pStyle w:val="ListNumber"/>
       </w:pPr>
       <w:r>
-        <w:t>European Southern Observatory. 2026. Milky Way's fastest star orbits our supermassive black hole so closely it feels its spin. https://www.eso.org/public/news/eso2612/</w:t>
+        <w:t>GRAVITY Collaboration. 2020. Detection of the Schwarzschild precession in the orbit of S2. A&amp;A 636, L5.</w:t>
+      </w:r>
+    </w:p>
+    <w:p>
+      <w:pPr>
+        <w:pStyle w:val="ListNumber"/>
+      </w:pPr>
+      <w:r>
+        <w:t>GRAVITY Collaboration. 2022. Mass distribution in the Galactic Center based on interferometric astrometry. A&amp;A 657, L12.</w:t>
+      </w:r>
+    </w:p>
+    <w:p>
+      <w:pPr>
+        <w:pStyle w:val="ListNumber"/>
+      </w:pPr>
+      <w:r>
+        <w:t>Gillessen, S., et al. 2009. Monitoring stellar orbits around the Massive Black Hole in the Galactic Center. ApJ 692, 1075.</w:t>
+      </w:r>
+    </w:p>
+    <w:p>
+      <w:pPr>
+        <w:pStyle w:val="ListNumber"/>
+      </w:pPr>
+      <w:r>
+        <w:t>Das, S., et al. 2008. Black hole entropy from entanglement: A review. arXiv:0806.0402.</w:t>
+      </w:r>
+    </w:p>
+    <w:p>
+      <w:pPr>
+        <w:pStyle w:val="ListNumber"/>
+      </w:pPr>
+      <w:r>
+        <w:t>European Southern Observatory. 2026. Milky Way's fastest star orbits our supermassive black hole. ESO News 2612.</w:t>
+      </w:r>
+    </w:p>
+    <w:p>
+      <w:pPr>
+        <w:pStyle w:val="ListNumber"/>
+      </w:pPr>
+      <w:r>
+        <w:t>European Space Agency. 2022. Gaia Data Release 3. https://gea.esac.esa.int/archive/</w:t>
+      </w:r>
+    </w:p>
+    <w:p>
+      <w:pPr>
+        <w:pStyle w:val="ListNumber"/>
+      </w:pPr>
+      <w:r>
+        <w:t>NASA Science. 2024. Dark Matter — Nancy Grace Roman Space Telescope. https://science.nasa.gov/mission/roman-space-telescope/dark-matter/</w:t>
+      </w:r>
+    </w:p>
+    <w:p>
+      <w:pPr>
+        <w:pStyle w:val="ListNumber"/>
+      </w:pPr>
+      <w:r>
+        <w:t>NASA Science. 2024. Hubble Space Telescope: The Science Behind Dark Matter. https://science.nasa.gov/mission/hubble/science/science-behind-the-discoveries/hubble-dark-matter/</w:t>
+      </w:r>
+    </w:p>
+    <w:p>
+      <w:pPr>
+        <w:pStyle w:val="ListNumber"/>
+      </w:pPr>
+      <w:r>
+        <w:t>Verlinde, E. 2011. On the Origin of Gravity and the Laws of Newton. JHEP 2011(4), 29.</w:t>
+      </w:r>
+    </w:p>
+    <w:p>
+      <w:pPr>
+        <w:pStyle w:val="ListNumber"/>
+      </w:pPr>
+      <w:r>
+        <w:t>Padmanabhan, T. 2015. Gravitational dynamics, thermodynamics and emergent gravity. Phys. Rev. D 92, 024001.</w:t>
       </w:r>
     </w:p>
     <w:p>
@@ -1481,17 +599,66 @@
     </w:p>
     <w:p>
       <w:r>
-        <w:t>The correct next move is not to abandon the original three-star black-hole experiment. It is to formalize it using real observational data, an explicit baseline, uncertainty propagation, and predeclared falsification criteria.</w:t>
+        <w:t>Formalizing the research framework using reproducible observations, uncertainty propagation, and falsification criteria.</w:t>
+      </w:r>
+    </w:p>
+    <w:p>
+      <w:pPr>
+        <w:pStyle w:val="Heading1"/>
+      </w:pPr>
+      <w:r>
+        <w:t>16. Research Archive / Sidebar Hypothesis Extension: Energy → Electromagnetism → Matter → Gravity</w:t>
       </w:r>
     </w:p>
     <w:p>
       <w:r>
-        <w:t>The central empirical test should reconstruct multiple observed stellar trajectories around Sagittarius A*, reproduce the published GR solution, compute candidate compression measures across the CG, CE, and CS formulations, and determine whether CSTMH produces a stable, falsifiable, independently measurable effect or cleanly collapses into gravitational geometry.</w:t>
+        <w:t>Archive Notice: This section records a formal theoretical sidebar investigation. In accordance with EMRF integrity protocols, this extension is preserved as an active hypothesis under test ('shooting holes in the bucket') rather than an established conclusion.</w:t>
+      </w:r>
+    </w:p>
+    <w:p>
+      <w:pPr>
+        <w:pStyle w:val="Heading2"/>
+      </w:pPr>
+      <w:r>
+        <w:t>16.1 The Core Generative Sequence</w:t>
       </w:r>
     </w:p>
     <w:p>
       <w:r>
-        <w:t>The central scientific question remains open. EMRF exists to make that question answerable.</w:t>
+        <w:t>The framework expands from static state mapping to a dynamic generative chain over time:</w:t>
+        <w:br/>
+        <w:t>spacetime → energy emergence → photon / electromagnetic field → interaction → accumulation / organization → matter → gravity</w:t>
+      </w:r>
+    </w:p>
+    <w:p>
+      <w:pPr>
+        <w:pStyle w:val="Heading2"/>
+      </w:pPr>
+      <w:r>
+        <w:t>16.2 Dynamic Role of Compression</w:t>
+      </w:r>
+    </w:p>
+    <w:p>
+      <w:r>
+        <w:t>Compression is no longer an isolated cause; it is the state variable describing what happens as energy becomes increasingly organized and concentrated within spacetime: C(X,t) = F(E, S, geometry, t).</w:t>
+      </w:r>
+    </w:p>
+    <w:p>
+      <w:pPr>
+        <w:pStyle w:val="Heading2"/>
+      </w:pPr>
+      <w:r>
+        <w:t>16.3 The Cosmological Scale Hierarchy</w:t>
+      </w:r>
+    </w:p>
+    <w:p>
+      <w:r>
+        <w:t>Rather than testing compression exclusively at the Sagittarius A* black hole orbit scale, the framework establishes a multi-scale testing program:</w:t>
+        <w:br/>
+        <w:t>photons → matter → stellar systems → black holes → galaxies → cosmology</w:t>
+        <w:br/>
+        <w:br/>
+        <w:t>At each physical scale (quantum pair production, S-star orbits, black hole event horizons, galactic halo velocity flatlining, and cosmic expansion), candidate expressions of C(X,t) are tested against empirical data.</w:t>
       </w:r>
     </w:p>
     <w:p>
@@ -1510,7 +677,7 @@
         <w:t xml:space="preserve">EMRF — </w:t>
       </w:r>
       <w:r>
-        <w:t>Emergent Matter Research Framework: umbrella research program.</w:t>
+        <w:t>Emergent Matter Research Framework.</w:t>
       </w:r>
     </w:p>
     <w:p>
@@ -1521,7 +688,7 @@
         <w:t xml:space="preserve">CSTMH — </w:t>
       </w:r>
       <w:r>
-        <w:t>Compressed Space-Time Matter Hypothesis: primary hypothesis under investigation.</w:t>
+        <w:t>Compressed Space-Time Matter Hypothesis.</w:t>
       </w:r>
     </w:p>
     <w:p>
@@ -1532,7 +699,18 @@
         <w:t xml:space="preserve">Compression C(X,t) — </w:t>
       </w:r>
       <w:r>
-        <w:t>Working state descriptor whose physical nature (geometric descriptor vs. novel quantity) is under empirical and mathematical investigation.</w:t>
+        <w:t>Working state descriptor under investigation.</w:t>
+      </w:r>
+    </w:p>
+    <w:p>
+      <w:r>
+        <w:rPr>
+          <w:b/>
+        </w:rPr>
+        <w:t xml:space="preserve">Dynamic Compression Functional — </w:t>
+      </w:r>
+      <w:r>
+        <w:t>C(X,t) = F(E, S, geometry, t) describing increasing energy-information organization over time.</w:t>
       </w:r>
     </w:p>
     <w:p>
@@ -1554,7 +732,7 @@
         <w:t xml:space="preserve">CE — </w:t>
       </w:r>
       <w:r>
-        <w:t>Gravitational energy compression functional based on coordinate-invariant quasi-local or asymptotic energy measures: CE = f(defensible energy measures).</w:t>
+        <w:t>Gravitational energy compression functional based on quasi-local/asymptotic energy measures: CE = f(energy measures).</w:t>
       </w:r>
     </w:p>
     <w:p>
@@ -1565,7 +743,7 @@
         <w:t xml:space="preserve">CS — </w:t>
       </w:r>
       <w:r>
-        <w:t>Entropy-coupled compression functional: CS = f(entropy/information + geometry).</w:t>
+        <w:t>Entropy/information-coupled compression functional: CS = f(entropy/information + geometry).</w:t>
       </w:r>
     </w:p>
     <w:p>
@@ -1576,7 +754,29 @@
         <w:t xml:space="preserve">CGSE — </w:t>
       </w:r>
       <w:r>
-        <w:t>Composite compression functional: CGSE = f(gμν, curvature, E, S, ...).</w:t>
+        <w:t>Composite compression functional: CGSE = f(g_μν, curvature, E, S, t, ...).</w:t>
+      </w:r>
+    </w:p>
+    <w:p>
+      <w:r>
+        <w:rPr>
+          <w:b/>
+        </w:rPr>
+        <w:t xml:space="preserve">U(X,t) — </w:t>
+      </w:r>
+      <w:r>
+        <w:t>Unidentified Mass-Energy Variable representing anomalous gravitational influences without presupposing particle dark matter.</w:t>
+      </w:r>
+    </w:p>
+    <w:p>
+      <w:r>
+        <w:rPr>
+          <w:b/>
+        </w:rPr>
+        <w:t xml:space="preserve">Cosmological Scale Hierarchy — </w:t>
+      </w:r>
+      <w:r>
+        <w:t>5-tier evaluation ladder testing C(X,t) across quantum fields, stellar orbits, black hole horizons, galactic halos, and cosmological expansion.</w:t>
       </w:r>
     </w:p>
     <w:p>
@@ -1587,7 +787,7 @@
         <w:t xml:space="preserve">X — </w:t>
       </w:r>
       <w:r>
-        <w:t>Generalized state coordinate representing spatial position plus additional dimensional/state degrees of freedom.</w:t>
+        <w:t>Generalized state coordinate spanning spacetime coordinates and internal/fiber degrees of freedom.</w:t>
       </w:r>
     </w:p>
     <w:p>
@@ -1598,7 +798,7 @@
         <w:t xml:space="preserve">M(X,t) — </w:t>
       </w:r>
       <w:r>
-        <w:t>Working matter-state or matter-density observable.</w:t>
+        <w:t>Emergent matter-density or matter-state observable.</w:t>
       </w:r>
     </w:p>
     <w:p>
@@ -1606,32 +806,10 @@
         <w:rPr>
           <w:b/>
         </w:rPr>
-        <w:t xml:space="preserve">S — </w:t>
+        <w:t xml:space="preserve">Quasi-Local Energy — </w:t>
       </w:r>
       <w:r>
-        <w:t>Entropy/information quantity; definition must be explicit in each model.</w:t>
-      </w:r>
-    </w:p>
-    <w:p>
-      <w:r>
-        <w:rPr>
-          <w:b/>
-        </w:rPr>
-        <w:t xml:space="preserve">Triangulation — </w:t>
-      </w:r>
-      <w:r>
-        <w:t>Informal description of constraining a common gravitational field using multiple independent stellar trajectories.</w:t>
-      </w:r>
-    </w:p>
-    <w:p>
-      <w:r>
-        <w:rPr>
-          <w:b/>
-        </w:rPr>
-        <w:t xml:space="preserve">Quasi-local energy — </w:t>
-      </w:r>
-      <w:r>
-        <w:t>Coordinate-invariant gravitational energy defined over a closed spacelike 2-surface (e.g. Brown-York, Hawking), resolving the non-localizability of gravitational field energy in GR.</w:t>
+        <w:t>Gauge-invariant measure of gravitational energy defined across closed spacelike 2-surfaces (e.g. Brown-York, Hawking).</w:t>
       </w:r>
     </w:p>
     <w:p>
@@ -1658,7 +836,7 @@
         <w:pStyle w:val="ListBullet"/>
       </w:pPr>
       <w:r>
-        <w:t>Never present an LLM interpretation as observational data.</w:t>
+        <w:t>Never present an AI or LLM interpretation as observational data.</w:t>
       </w:r>
     </w:p>
     <w:p>
@@ -1666,7 +844,7 @@
         <w:pStyle w:val="ListBullet"/>
       </w:pPr>
       <w:r>
-        <w:t>Every external dataset must retain provenance and access date.</w:t>
+        <w:t>Every external dataset must retain complete provenance, query parameters, and access date.</w:t>
       </w:r>
     </w:p>
     <w:p>
@@ -1674,7 +852,7 @@
         <w:pStyle w:val="ListBullet"/>
       </w:pPr>
       <w:r>
-        <w:t>Every raw-to-derived transformation must be logged and reproducible.</w:t>
+        <w:t>Every raw-to-derived data transformation must be deterministic, logged, and reproducible.</w:t>
       </w:r>
     </w:p>
     <w:p>
@@ -1682,7 +860,7 @@
         <w:pStyle w:val="ListBullet"/>
       </w:pPr>
       <w:r>
-        <w:t>Every model must declare its free parameters and priors.</w:t>
+        <w:t>Every model must declare its free parameters, priors, and degrees of freedom.</w:t>
       </w:r>
     </w:p>
     <w:p>
@@ -1690,7 +868,7 @@
         <w:pStyle w:val="ListBullet"/>
       </w:pPr>
       <w:r>
-        <w:t>Do not tune and validate on the same observations without a declared protocol.</w:t>
+        <w:t>Do not tune parameters and validate models on the same observational data without a declared split protocol.</w:t>
       </w:r>
     </w:p>
     <w:p>
@@ -1698,7 +876,7 @@
         <w:pStyle w:val="ListBullet"/>
       </w:pPr>
       <w:r>
-        <w:t>Report negative and null results with the same prominence as positive findings.</w:t>
+        <w:t>Report negative, null, and inconclusive results with the same prominence as positive findings.</w:t>
       </w:r>
     </w:p>
     <w:p>
@@ -1706,7 +884,7 @@
         <w:pStyle w:val="ListBullet"/>
       </w:pPr>
       <w:r>
-        <w:t>Preserve failed hypotheses and discarded equations in the archive.</w:t>
+        <w:t>Preserve failed hypotheses and discarded equations in an immutable archive.</w:t>
       </w:r>
     </w:p>
     <w:p>
@@ -1714,7 +892,7 @@
         <w:pStyle w:val="ListBullet"/>
       </w:pPr>
       <w:r>
-        <w:t>Use independent implementations when a result is central.</w:t>
+        <w:t>Use independent mathematical implementations when verifying central results.</w:t>
       </w:r>
     </w:p>
     <w:p>
@@ -1722,7 +900,7 @@
         <w:pStyle w:val="ListBullet"/>
       </w:pPr>
       <w:r>
-        <w:t>Keep established physics, hypothesis, derivation, and empirical result visually and mathematically distinct.</w:t>
+        <w:t>Maintain strict, visual, and mathematical separation between established physics, hypotheses, derivations, and empirical fits.</w:t>
       </w:r>
     </w:p>
     <w:p>
@@ -1730,7 +908,7 @@
         <w:pStyle w:val="ListBullet"/>
       </w:pPr>
       <w:r>
-        <w:t>Do not claim a new fundamental force when a geometric or thermodynamic reformulation of established physics suffices.</w:t>
+        <w:t>Never postulate a new fundamental force when a geometric or thermodynamic reformulation of established physics is sufficient.</w:t>
       </w:r>
     </w:p>
     <w:sectPr>

</xml_diff>

<commit_message>
feat(theory): integrate dictionary-building nomenclature, 4-layer language, and emergent gravity paradigm
</commit_message>
<xml_diff>
--- a/SpaceEntropyCompression/Documents/EMRF_Comprehensive_Research_Audit_and_Paper_Draft.docx
+++ b/SpaceEntropyCompression/Documents/EMRF_Comprehensive_Research_Audit_and_Paper_Draft.docx
@@ -34,7 +34,7 @@
         <w:br/>
         <w:t>Project: D:\Projects\Theory\SpaceEntropyCompression</w:t>
         <w:br/>
-        <w:t>Sidebar Extension: Temporal Emergence, Energy-EM-Matter-Gravity Chain, and Unidentified Mass-Energy U(X,t)</w:t>
+        <w:t>Sidebar Extension: Temporal Emergence, 4-Layer Scientific Language, and Emergent Gravity</w:t>
       </w:r>
     </w:p>
     <w:p>
@@ -48,11 +48,6 @@
     <w:p>
       <w:r>
         <w:t>This document consolidates the current conceptual, mathematical, computational, and empirical research program developed within the Emergent Matter Research Framework (EMRF). It is intentionally structured as a critical research document rather than an unverified assertion of physical truth. The central hypothesis remains provisional. Established physics—specifically General Relativity, quantum field theory, and relativistic thermodynamics—is treated as the immutable baseline against which all new predictions must be evaluated.</w:t>
-      </w:r>
-    </w:p>
-    <w:p>
-      <w:r>
-        <w:t>The strongest current formulation posits that matter may be an emergent manifestation of spacetime under a state described, at the meta level, as compression. 'Compression' is not assumed a priori to be a single primitive scalar or a novel fundamental force. Rather, it represents a top-down descriptor whose exact mathematical realization is the central unsolved problem of this research program. The current investigation examines whether spacetime geometry, rigorously formulated gravitational energy measures, and well-defined entropy/information measures jointly characterize that state.</w:t>
       </w:r>
     </w:p>
     <w:p>
@@ -73,21 +68,11 @@
       </w:r>
     </w:p>
     <w:p>
-      <w:r>
-        <w:t>This academic posture is significantly stronger because it gives nature the uninhibited opportunity to tell us we are wrong, establishing a strict falsification protocol grounded in empirical astrophysics.</w:t>
-      </w:r>
-    </w:p>
-    <w:p>
       <w:pPr>
         <w:pStyle w:val="Heading1"/>
       </w:pPr>
       <w:r>
         <w:t>Executive Summary</w:t>
-      </w:r>
-    </w:p>
-    <w:p>
-      <w:r>
-        <w:t>The EMRF project has evolved from a conceptual inquiry regarding compressed spacetime into a formal multidisciplinary research framework combining differential geometry, gravitation, thermodynamics, astrophysical observations, numerical simulation, symbolic mathematics, and rigorous model selection.</w:t>
       </w:r>
     </w:p>
     <w:p>
@@ -108,17 +93,7 @@
     </w:p>
     <w:p>
       <w:r>
-        <w:t>Where M(X,t) denotes an emergent matter-density or matter-state observable; C(X,t) denotes the as-yet-to-be-derived compression descriptor; C0 is a reference state; k is a scale factor; and alpha is a scaling exponent.</w:t>
-      </w:r>
-    </w:p>
-    <w:p>
-      <w:r>
-        <w:t>A primary conceptual refinement is that X is an extended generalized state coordinate: X = {x, y, z, d1, d2, ..., dn}.</w:t>
-      </w:r>
-    </w:p>
-    <w:p>
-      <w:r>
-        <w:t>The empirical verification program is anchored on real stellar astrometry and spectroscopy in the Galactic Center, where multiple stars (S2, S29, S38, S55) orbit the supermassive black hole Sagittarius A*.</w:t>
+        <w:t>Where M(X,t) denotes an emergent matter-density observable; C(X,t) denotes the compression state variable; and X is an extended generalized state coordinate X = {x, y, z, d1, d2, ..., dn}.</w:t>
       </w:r>
     </w:p>
     <w:p>
@@ -134,12 +109,12 @@
         <w:rPr>
           <w:b/>
         </w:rPr>
-        <w:t>spacetime → energy emergence → photon / EM field → interaction → accumulation / organization → matter → gravity</w:t>
+        <w:t>Spacetime → Energy → Field organization → Compression → Matter → Emergent Gravity</w:t>
       </w:r>
     </w:p>
     <w:p>
       <w:r>
-        <w:t>where compression C(X,t) = F(E, S, geometry, t) is recognized as the dynamic state variable describing the increasing organization of energy-information over time across a five-tier Cosmological Scale Hierarchy.</w:t>
+        <w:t>where compression C(X,t) = F(E, S, geometry, t) is recognized as the dynamic state variable describing the increasing organization of energy-momentum within spacetime degrees of freedom over time across a five-tier Cosmological Scale Hierarchy.</w:t>
       </w:r>
     </w:p>
     <w:p>
@@ -156,8 +131,37 @@
       </w:r>
     </w:p>
     <w:p>
+      <w:pPr>
+        <w:pStyle w:val="Heading2"/>
+      </w:pPr>
       <w:r>
-        <w:t>The term 'compression' is intentionally used as a meta-level visual and conceptual descriptor. Visual analogies—including pressure, phase transitions, cellular turnover, biological evolution, and the heuristic 'Dark → Light' transition—serve as cognitive hypothesis-generation tools. They do not constitute empirical evidence.</w:t>
+        <w:t>1.1 The Four Layers of Scientific Language</w:t>
+      </w:r>
+    </w:p>
+    <w:p>
+      <w:r>
+        <w:t>EMRF establishes an explicit boundary across four distinct layers of language:</w:t>
+        <w:br/>
+        <w:t>1. Human Language (The Vision): Dark → Energy → Light → Organization → Matter → Gravity.</w:t>
+        <w:br/>
+        <w:t>2. Physical Language (The Theory): Spacetime → fields → energy-momentum → interaction → structure → matter → gravitational geometry.</w:t>
+        <w:br/>
+        <w:t>3. Mathematical Language (The Formulation): M, g_μν, T_μν, F_μν, S, C(X,t), M(X,t).</w:t>
+        <w:br/>
+        <w:t>4. Empirical Language (The Observables): x(t), v(t), a(t), z(t), F_μν, L, T, S, curvature residuals.</w:t>
+      </w:r>
+    </w:p>
+    <w:p>
+      <w:pPr>
+        <w:pStyle w:val="Heading2"/>
+      </w:pPr>
+      <w:r>
+        <w:t>1.2 Developing Nomenclature Ahead of Mathematical Stabilization: Building the Dictionary</w:t>
+      </w:r>
+    </w:p>
+    <w:p>
+      <w:r>
+        <w:t>A critical operational insight raised by the author is: 'I am deriving a language so I can describe it and know that you will have nomenclature.' Developing vocabulary for a physical hypothesis before the mathematics has completely stabilized is a legitimate and necessary stage of theory development. The theoretical framework acts as the dictionary builder—formalizing candidate terms while maintaining a hard boundary between the vocabulary, the hypothesis, the derivation, and the empirical result, holding the scientific red pen ready whenever nature objects.</w:t>
       </w:r>
     </w:p>
     <w:p>
@@ -170,7 +174,7 @@
     </w:p>
     <w:p>
       <w:r>
-        <w:t>Fundamental spacetime (M, g_μν)</w:t>
+        <w:t>Fundamental Spacetime (M, g_μν)</w:t>
         <w:br/>
         <w:t xml:space="preserve">        ↓</w:t>
         <w:br/>
@@ -206,24 +210,8 @@
       </w:r>
     </w:p>
     <w:p>
-      <w:pPr>
-        <w:pStyle w:val="Heading2"/>
-      </w:pPr>
-      <w:r>
-        <w:t>3.1 Working matter relation</w:t>
-      </w:r>
-    </w:p>
-    <w:p>
       <w:r>
         <w:t>M(X,t) = k [ C(X,t) / C0 ]^alpha</w:t>
-      </w:r>
-    </w:p>
-    <w:p>
-      <w:pPr>
-        <w:pStyle w:val="Heading2"/>
-      </w:pPr>
-      <w:r>
-        <w:t>3.2 Generalized coordinate</w:t>
       </w:r>
     </w:p>
     <w:p>
@@ -232,32 +220,12 @@
       </w:r>
     </w:p>
     <w:p>
-      <w:pPr>
-        <w:pStyle w:val="Heading2"/>
-      </w:pPr>
       <w:r>
-        <w:t>3.3 Compression as a derived dynamic functional</w:t>
-      </w:r>
-    </w:p>
-    <w:p>
-      <w:r>
-        <w:t>C(X,t) → F[g_μν, R, R_μν, R_μνρσ, T_μν, S, E, t, ...]</w:t>
+        <w:t>Compression is provisionally defined as: Compression = the state of organized energy-momentum within spacetime degrees of freedom over time.</w:t>
         <w:br/>
+        <w:t>Prospective nomenclature includes Spacetime Energy Organization (SEO) or Geometric Energy Organization (GEO).</w:t>
         <w:br/>
-        <w:t>A vital mathematical refinement is that compression is not merely a static spatial curvature slice; it represents the measurable state variable of increasing organizational concentration of energy-information over time: C(X,t) = F(E, S, geometry, t).</w:t>
-      </w:r>
-    </w:p>
-    <w:p>
-      <w:pPr>
-        <w:pStyle w:val="Heading2"/>
-      </w:pPr>
-      <w:r>
-        <w:t>3.4 Space and entropy</w:t>
-      </w:r>
-    </w:p>
-    <w:p>
-      <w:r>
-        <w:t>C = F(g_μν, S, ∇_μ S, Curvature, T_μν, t)</w:t>
+        <w:t>Mathematical form: C(X,t) = F(E, S, geometry, t).</w:t>
       </w:r>
     </w:p>
     <w:p>
@@ -316,7 +284,7 @@
     </w:p>
     <w:p>
       <w:r>
-        <w:t>In General Relativity, the Equivalence Principle (Γ^μ_αβ = 0 in locally flat inertial frames) forbids any gauge-invariant local tensor representing gravitational energy density. Any energy-based compression branch (CE) must be formulated using coordinate-invariant quasi-local surface integrals (Brown-York, Hawking mass) or asymptotic boundary invariants (ADM, Bondi mass).</w:t>
+        <w:t>In General Relativity, the Equivalence Principle forbids any gauge-invariant local tensor representing gravitational energy density. Any energy branch must use coordinate-invariant quasi-local surface integrals (Brown-York, Hawking mass) or asymptotic invariants (ADM, Bondi mass).</w:t>
       </w:r>
     </w:p>
     <w:p>
@@ -329,7 +297,7 @@
     </w:p>
     <w:p>
       <w:r>
-        <w:t>Ted Jacobson's 1995 derivation (Phys. Rev. Lett. 75, 1260) proved that Einstein's field equation emerges as a thermodynamic equation of state from causal horizon entropy (δS = η δA) and the Clausius relation (δQ = T dS). This provides legitimate theoretical precedent for deriving gravitational geometry from horizon thermodynamics.</w:t>
+        <w:t>Ted Jacobson's 1995 derivation (Phys. Rev. Lett. 75, 1260) proved that Einstein's field equation emerges as a thermodynamic equation of state from causal horizon entropy (δS = η δA) and the Clausius relation (δQ = T dS).</w:t>
       </w:r>
     </w:p>
     <w:p>
@@ -342,7 +310,7 @@
     </w:p>
     <w:p>
       <w:r>
-        <w:t>Bekenstein-Hawking area bounds (S_BH = A / 4G) must be preserved in the black hole limit.</w:t>
+        <w:t>Preserves Bekenstein-Hawking area bounds (S_BH = A / 4G).</w:t>
       </w:r>
     </w:p>
     <w:p>
@@ -355,12 +323,9 @@
     </w:p>
     <w:p>
       <w:r>
-        <w:t>1. Known Field Mechanisms: Energy-to-matter conversion is verified in quantum electrodynamics via pair production: γ + γ → e- + e+. Photons carry energy E_γ = hν and momentum p_γ = h/λ. EMRF investigates whether a macroscopic or cosmological analogue governs matter emergence.</w:t>
+        <w:t>1. Known Field Mechanisms: Energy-to-matter conversion via pair production (γ + γ → e- + e+).</w:t>
         <w:br/>
-        <w:br/>
-        <w:t>2. The Unidentified Mass-Energy Variable U(X,t): In galactic dynamics, gravitational influences exceed visible matter (NASA Hubble and Roman Space Telescope data). Rather than assuming this is non-baryonic particle dark matter, EMRF defines U(X,t) as an open hypothesis space:</w:t>
-        <w:br/>
-        <w:t xml:space="preserve">   U(X,t) = { dark matter, unaccounted baryonic matter, new field, modified gravity, emergent compression phenomenon, or something else }.</w:t>
+        <w:t>2. Unidentified Mass-Energy Variable U(X,t): Open hypothesis space avoiding premature assumptions of particle dark matter.</w:t>
       </w:r>
     </w:p>
     <w:p>
@@ -378,6 +343,24 @@
     </w:p>
     <w:p>
       <w:pPr>
+        <w:pStyle w:val="Heading2"/>
+      </w:pPr>
+      <w:r>
+        <w:t>5.3 The Core Causal Paradigm Test</w:t>
+      </w:r>
+    </w:p>
+    <w:p>
+      <w:r>
+        <w:t>Conventional GR: T_μν → G_μν → stellar trajectories</w:t>
+        <w:br/>
+        <w:t>Emergent Compression: C(X,t) → G_μν → stellar trajectories</w:t>
+        <w:br/>
+        <w:br/>
+        <w:t>The experiment determines whether these two descriptions are mathematically equivalent, complementary, or empirically distinguishable.</w:t>
+      </w:r>
+    </w:p>
+    <w:p>
+      <w:pPr>
         <w:pStyle w:val="Heading1"/>
       </w:pPr>
       <w:r>
@@ -386,7 +369,7 @@
     </w:p>
     <w:p>
       <w:r>
-        <w:t>Model hierarchy: M0 (Newtonian) → M1 (1PN Schwarzschild precession + redshift) → M2 (Full Kerr GR) → M3a (CG) → M3b (CE) → M3c (CS) → M4 (CGSE composite, evaluated against Bayesian Information Criterion).</w:t>
+        <w:t>Model comparison and Bayesian Information Criterion (BIC) evaluation across M0 through M4.</w:t>
       </w:r>
     </w:p>
     <w:p>
@@ -394,12 +377,12 @@
         <w:pStyle w:val="Heading1"/>
       </w:pPr>
       <w:r>
-        <w:t>7. AI, MCP, and Orchestration Architecture</w:t>
+        <w:t>7. AI, MCP, and Architecture</w:t>
       </w:r>
     </w:p>
     <w:p>
       <w:r>
-        <w:t>Project repository structure at D:\Projects\theory\SpaceEntropyCompression.</w:t>
+        <w:t>Project repository layout at D:\Projects\theory\SpaceEntropyCompression.</w:t>
       </w:r>
     </w:p>
     <w:p>
@@ -412,7 +395,7 @@
     </w:p>
     <w:p>
       <w:r>
-        <w:t>Key findings and requirements for rigorous model comparison.</w:t>
+        <w:t>Summary of findings and requirements for rigorous model comparison.</w:t>
       </w:r>
     </w:p>
     <w:p>
@@ -435,12 +418,12 @@
         <w:pStyle w:val="Heading1"/>
       </w:pPr>
       <w:r>
-        <w:t>11. Publication Strategy and Philosophical Precision</w:t>
+        <w:t>11. Publication Strategy and Academic Precision</w:t>
       </w:r>
     </w:p>
     <w:p>
       <w:r>
-        <w:t>Strict adherence to objective scientific reporting and Popperian falsification.</w:t>
+        <w:t>Academic standards and falsification integrity.</w:t>
       </w:r>
     </w:p>
     <w:p>
@@ -453,7 +436,7 @@
     </w:p>
     <w:p>
       <w:r>
-        <w:t>Freeze hypothesis, ingest ESO S-star data, calibrate GR baseline, evaluate candidate functionals.</w:t>
+        <w:t>Staged execution plan across Sagittarius A* astrometry.</w:t>
       </w:r>
     </w:p>
     <w:p>
@@ -625,9 +608,9 @@
     </w:p>
     <w:p>
       <w:r>
-        <w:t>The framework expands from static state mapping to a dynamic generative chain over time:</w:t>
+        <w:t>Spacetime → Energy → Field organization → Compression → Matter → Emergent Gravity</w:t>
         <w:br/>
-        <w:t>spacetime → energy emergence → photon / electromagnetic field → interaction → accumulation / organization → matter → gravity</w:t>
+        <w:t>followed by: Matter + Gravity + Interaction → Thermodynamic evolution.</w:t>
       </w:r>
     </w:p>
     <w:p>
@@ -635,12 +618,14 @@
         <w:pStyle w:val="Heading2"/>
       </w:pPr>
       <w:r>
-        <w:t>16.2 Dynamic Role of Compression</w:t>
+        <w:t>16.2 Dynamic Role of Compression &amp; Nomenclature</w:t>
       </w:r>
     </w:p>
     <w:p>
       <w:r>
-        <w:t>Compression is no longer an isolated cause; it is the state variable describing what happens as energy becomes increasingly organized and concentrated within spacetime: C(X,t) = F(E, S, geometry, t).</w:t>
+        <w:t>Compression is the measurable state variable describing what happens as energy becomes increasingly organized and concentrated within spacetime degrees of freedom over time: C(X,t) = F(E, S, geometry, t).</w:t>
+        <w:br/>
+        <w:t>Working descriptor: Spacetime Energy Organization (SEO) / Geometric Energy Organization (GEO).</w:t>
       </w:r>
     </w:p>
     <w:p>
@@ -648,17 +633,28 @@
         <w:pStyle w:val="Heading2"/>
       </w:pPr>
       <w:r>
-        <w:t>16.3 The Cosmological Scale Hierarchy</w:t>
+        <w:t>16.3 Emergent Gravity Functional</w:t>
       </w:r>
     </w:p>
     <w:p>
       <w:r>
-        <w:t>Rather than testing compression exclusively at the Sagittarius A* black hole orbit scale, the framework establishes a multi-scale testing program:</w:t>
-        <w:br/>
+        <w:t>Gravity = G[C(X,t)]. The Einstein field equations emerge as a macroscopic equation of state from this deeper relationship.</w:t>
+      </w:r>
+    </w:p>
+    <w:p>
+      <w:pPr>
+        <w:pStyle w:val="Heading2"/>
+      </w:pPr>
+      <w:r>
+        <w:t>16.4 The Cosmological Scale Hierarchy</w:t>
+      </w:r>
+    </w:p>
+    <w:p>
+      <w:r>
         <w:t>photons → matter → stellar systems → black holes → galaxies → cosmology</w:t>
         <w:br/>
         <w:br/>
-        <w:t>At each physical scale (quantum pair production, S-star orbits, black hole event horizons, galactic halo velocity flatlining, and cosmic expansion), candidate expressions of C(X,t) are tested against empirical data.</w:t>
+        <w:t>At each physical scale, candidate expressions of C(X,t) are tested against empirical data.</w:t>
       </w:r>
     </w:p>
     <w:p>
@@ -707,10 +703,21 @@
         <w:rPr>
           <w:b/>
         </w:rPr>
+        <w:t xml:space="preserve">Spacetime Energy Organization (SEO) / GEO — </w:t>
+      </w:r>
+      <w:r>
+        <w:t>Prospective formal nomenclature for the compression state variable.</w:t>
+      </w:r>
+    </w:p>
+    <w:p>
+      <w:r>
+        <w:rPr>
+          <w:b/>
+        </w:rPr>
         <w:t xml:space="preserve">Dynamic Compression Functional — </w:t>
       </w:r>
       <w:r>
-        <w:t>C(X,t) = F(E, S, geometry, t) describing increasing energy-information organization over time.</w:t>
+        <w:t>C(X,t) = F(E, S, geometry, t) describing increasing energy-momentum organization in spacetime over time.</w:t>
       </w:r>
     </w:p>
     <w:p>

</xml_diff>